<commit_message>
docs: update Project Proposal with 3 system diagrams
- Figure 1: Full pipeline flowchart (source code to HTML gallery)
- Figure 2: Multi-LLM parallel generation architecture
- Figure 3: Five-metric accuracy scoring framework bar chart

https://claude.ai/code/session_01QPSkAFtbZn3ff725Qjto81
</commit_message>
<xml_diff>
--- a/Project_Proposal_Team5.docx
+++ b/Project_Proposal_Team5.docx
@@ -4,7 +4,7 @@
   <w:body>
     <w:p>
       <w:pPr>
-        <w:spacing w:before="0" w:after="40"/>
+        <w:spacing w:after="40"/>
         <w:jc w:val="center"/>
       </w:pPr>
       <w:r>
@@ -18,7 +18,7 @@
     </w:p>
     <w:p>
       <w:pPr>
-        <w:spacing w:after="80"/>
+        <w:spacing w:after="100"/>
         <w:jc w:val="center"/>
       </w:pPr>
       <w:r>
@@ -31,13 +31,13 @@
     </w:p>
     <w:p>
       <w:pPr>
-        <w:spacing w:before="120" w:after="40"/>
+        <w:spacing w:before="140" w:after="40"/>
       </w:pPr>
       <w:r>
         <w:rPr>
           <w:b/>
           <w:color w:val="00467F"/>
-          <w:sz w:val="22"/>
+          <w:sz w:val="21"/>
         </w:rPr>
         <w:t>1. Problem Statement</w:t>
       </w:r>
@@ -50,18 +50,71 @@
         <w:rPr>
           <w:sz w:val="18"/>
         </w:rPr>
-        <w:t>Maintaining accurate software documentation is a persistent challenge in modern software engineering. UML sequence and class diagrams are essential artifacts for understanding system architecture and runtime behavior, yet their manual creation is labor-intensive, error-prone, and quickly becomes outdated as codebases evolve. This documentation drift hinders developer onboarding, code maintenance, and cross-team collaboration. The scope of the problem spans all software projects regardless of size or language, making an automated, reliable solution broadly impactful. This project addresses the challenge by building a pipeline that automatically generates high-quality UML diagrams directly from source code using multiple Large Language Models (LLMs) in parallel, with built-in quality evaluation and accuracy measurement.</w:t>
+        <w:t>Maintaining accurate software documentation is a persistent challenge in modern software engineering. UML sequence and class diagrams are essential for understanding system architecture and runtime behavior, yet their manual creation is labor-intensive, error-prone, and quickly becomes outdated as codebases evolve. This documentation drift hinders developer onboarding, debugging, and cross-team collaboration across all project sizes and programming languages. This project automates high-quality UML diagram generation directly from source code using five LLMs in parallel, with built-in quality judging and closed-loop accuracy measurement — eliminating manual diagramming entirely.</w:t>
       </w:r>
     </w:p>
     <w:p>
       <w:pPr>
-        <w:spacing w:before="120" w:after="40"/>
+        <w:jc w:val="center"/>
+      </w:pPr>
+      <w:r>
+        <w:drawing>
+          <wp:inline xmlns:a="http://schemas.openxmlformats.org/drawingml/2006/main" xmlns:pic="http://schemas.openxmlformats.org/drawingml/2006/picture">
+            <wp:extent cx="4754880" cy="6096802"/>
+            <wp:docPr id="1" name="Picture 1"/>
+            <wp:cNvGraphicFramePr>
+              <a:graphicFrameLocks noChangeAspect="1"/>
+            </wp:cNvGraphicFramePr>
+            <a:graphic>
+              <a:graphicData uri="http://schemas.openxmlformats.org/drawingml/2006/picture">
+                <pic:pic>
+                  <pic:nvPicPr>
+                    <pic:cNvPr id="0" name="image.png"/>
+                    <pic:cNvPicPr/>
+                  </pic:nvPicPr>
+                  <pic:blipFill>
+                    <a:blip r:embed="rId9"/>
+                    <a:stretch>
+                      <a:fillRect/>
+                    </a:stretch>
+                  </pic:blipFill>
+                  <pic:spPr>
+                    <a:xfrm>
+                      <a:off x="0" y="0"/>
+                      <a:ext cx="4754880" cy="6096802"/>
+                    </a:xfrm>
+                    <a:prstGeom prst="rect"/>
+                  </pic:spPr>
+                </pic:pic>
+              </a:graphicData>
+            </a:graphic>
+          </wp:inline>
+        </w:drawing>
+      </w:r>
+    </w:p>
+    <w:p>
+      <w:pPr>
+        <w:spacing w:before="40" w:after="120"/>
+        <w:jc w:val="center"/>
+      </w:pPr>
+      <w:r>
+        <w:rPr>
+          <w:i/>
+          <w:color w:val="505050"/>
+          <w:sz w:val="16"/>
+        </w:rPr>
+        <w:t>Figure 1 – Full pipeline: from source code input to diagram gallery output</w:t>
+      </w:r>
+    </w:p>
+    <w:p>
+      <w:pPr>
+        <w:spacing w:before="140" w:after="40"/>
       </w:pPr>
       <w:r>
         <w:rPr>
           <w:b/>
           <w:color w:val="00467F"/>
-          <w:sz w:val="22"/>
+          <w:sz w:val="21"/>
         </w:rPr>
         <w:t>2. Related Work</w:t>
       </w:r>
@@ -86,7 +139,7 @@
         <w:rPr>
           <w:sz w:val="16"/>
         </w:rPr>
-        <w:t>Brown, T. B., et al. (2020). "Language Models are Few-Shot Learners." Advances in Neural Information Processing Systems (NeurIPS), 33, 1877–1901.</w:t>
+        <w:t>Brown, T. B., et al. (2020). "Language Models are Few-Shot Learners." NeurIPS, 33, 1877–1901.</w:t>
       </w:r>
     </w:p>
     <w:p>
@@ -98,7 +151,7 @@
         <w:rPr>
           <w:sz w:val="16"/>
         </w:rPr>
-        <w:t>Chen, M., et al. (2021). "Evaluating Large Language Models Trained on Code." arXiv preprint arXiv:2107.03374. OpenAI Codex.</w:t>
+        <w:t>Chen, M., et al. (2021). "Evaluating Large Language Models Trained on Code (Codex)." arXiv:2107.03374.</w:t>
       </w:r>
     </w:p>
     <w:p>
@@ -110,7 +163,7 @@
         <w:rPr>
           <w:sz w:val="16"/>
         </w:rPr>
-        <w:t>Zan, D., et al. (2023). "Large Language Models Meet NL2Code: A Survey." Proceedings of the 61st Annual Meeting of the ACL, 7443–7464.</w:t>
+        <w:t>Zan, D., et al. (2023). "Large Language Models Meet NL2Code: A Survey." Proceedings of ACL 2023, 7443–7464.</w:t>
       </w:r>
     </w:p>
     <w:p>
@@ -122,7 +175,7 @@
         <w:rPr>
           <w:sz w:val="16"/>
         </w:rPr>
-        <w:t>Wei, J., et al. (2022). "Chain-of-Thought Prompting Elicits Reasoning in Large Language Models." NeurIPS 35, 24824–24837.</w:t>
+        <w:t>Wei, J., et al. (2022). "Chain-of-Thought Prompting Elicits Reasoning in LLMs." NeurIPS 35, 24824–24837.</w:t>
       </w:r>
     </w:p>
     <w:p>
@@ -134,7 +187,7 @@
         <w:rPr>
           <w:sz w:val="16"/>
         </w:rPr>
-        <w:t>Guo, D., et al. (2024). "DeepSeek-Coder: When the Large Language Model Meets Programming – The Rise of Code Intelligence." arXiv:2401.14196.</w:t>
+        <w:t>Guo, D., et al. (2024). "DeepSeek-Coder: When the LLM Meets Programming." arXiv:2401.14196.</w:t>
       </w:r>
     </w:p>
     <w:p>
@@ -146,7 +199,7 @@
         <w:rPr>
           <w:sz w:val="16"/>
         </w:rPr>
-        <w:t>Lethbridge, T. C., Singer, J., &amp; Forward, A. (2003). "How Software Engineers Use Documentation: The State of the Practice." IEEE Software, 20(6), 35–39.</w:t>
+        <w:t>Lethbridge, T. C., Singer, J., &amp; Forward, A. (2003). "How Software Engineers Use Documentation." IEEE Software, 20(6), 35–39.</w:t>
       </w:r>
     </w:p>
     <w:p>
@@ -158,7 +211,7 @@
         <w:rPr>
           <w:sz w:val="16"/>
         </w:rPr>
-        <w:t>Philippow, I., Streitferdt, D., Riebisch, M., &amp; Naumann, S. (2005). "An Approach for Reverse Engineering of Design Patterns." SEKE 2005, Springer.</w:t>
+        <w:t>Philippow, I., et al. (2005). "An Approach for Reverse Engineering of Design Patterns." SEKE 2005, Springer.</w:t>
       </w:r>
     </w:p>
     <w:p>
@@ -170,7 +223,7 @@
         <w:rPr>
           <w:sz w:val="16"/>
         </w:rPr>
-        <w:t>Treude, C., &amp; Robillard, M. P. (2016). "Augmenting API Documentation with Insights from Stack Overflow." ICSE 2016, IEEE, 392–403.</w:t>
+        <w:t>Treude, C., &amp; Robillard, M. P. (2016). "Augmenting API Documentation with Insights from Stack Overflow." ICSE 2016, 392–403.</w:t>
       </w:r>
     </w:p>
     <w:p>
@@ -182,7 +235,7 @@
         <w:rPr>
           <w:sz w:val="16"/>
         </w:rPr>
-        <w:t>Mäder, P., &amp; Egyed, A. (2015). "Do Developers Benefit from Requirements Traceability When Evolving and Maintaining a Software System?" Empirical Software Engineering, 20(2), 413–453.</w:t>
+        <w:t>Mäder, P., &amp; Egyed, A. (2015). "Do Developers Benefit from Requirements Traceability?" Empirical Software Engineering, 20(2), 413–453.</w:t>
       </w:r>
     </w:p>
     <w:p>
@@ -194,18 +247,18 @@
         <w:rPr>
           <w:sz w:val="16"/>
         </w:rPr>
-        <w:t>Bavota, G., De Lucia, A., Di Penta, M., Oliveto, R., &amp; Palomba, F. (2015). "An Experimental Investigation on the Innate Relationship Between Quality and Refactoring." JSS, Elsevier, 107, 1–23.</w:t>
+        <w:t>Bavota, G., et al. (2015). "An Experimental Investigation on the Innate Relationship Between Quality and Refactoring." JSS, Elsevier, 107, 1–23.</w:t>
       </w:r>
     </w:p>
     <w:p>
       <w:pPr>
-        <w:spacing w:before="120" w:after="40"/>
+        <w:spacing w:before="140" w:after="40"/>
       </w:pPr>
       <w:r>
         <w:rPr>
           <w:b/>
           <w:color w:val="00467F"/>
-          <w:sz w:val="22"/>
+          <w:sz w:val="21"/>
         </w:rPr>
         <w:t>3. Research Gap</w:t>
       </w:r>
@@ -218,18 +271,71 @@
         <w:rPr>
           <w:sz w:val="18"/>
         </w:rPr>
-        <w:t>Existing UML generation tools rely on static analysis (AST parsing, reflection APIs) that capture structural information but fail to model semantic behavior or runtime interaction patterns. Early LLM-based approaches generate diagrams from a single model without comparative evaluation, offering no quality guarantee. No prior work combines: (a) parallel multi-provider LLM generation, (b) automated LLM-based judging of diagram quality, and (c) reconstruction-based accuracy scoring as a closed-loop validation mechanism. This triple gap — diversity, evaluation, and measurable accuracy — is what the proposed system fills.</w:t>
+        <w:t>Existing UML generation tools rely on static analysis (AST parsing, reflection APIs), capturing structural information but missing semantic behavior and runtime interaction. Single-model LLM approaches generate diagrams without comparative quality evaluation, offering no accuracy guarantee. No prior work combines: (a) parallel multi-provider LLM generation, (b) automated LLM-based diagram judging, and (c) reconstruction-based accuracy scoring as a closed-loop validation mechanism. This triple gap — diversity, evaluation, and measurable fidelity — is precisely what this system addresses.</w:t>
       </w:r>
     </w:p>
     <w:p>
       <w:pPr>
-        <w:spacing w:before="120" w:after="40"/>
+        <w:jc w:val="center"/>
+      </w:pPr>
+      <w:r>
+        <w:drawing>
+          <wp:inline xmlns:a="http://schemas.openxmlformats.org/drawingml/2006/main" xmlns:pic="http://schemas.openxmlformats.org/drawingml/2006/picture">
+            <wp:extent cx="5303520" cy="3336015"/>
+            <wp:docPr id="2" name="Picture 2"/>
+            <wp:cNvGraphicFramePr>
+              <a:graphicFrameLocks noChangeAspect="1"/>
+            </wp:cNvGraphicFramePr>
+            <a:graphic>
+              <a:graphicData uri="http://schemas.openxmlformats.org/drawingml/2006/picture">
+                <pic:pic>
+                  <pic:nvPicPr>
+                    <pic:cNvPr id="0" name="image.png"/>
+                    <pic:cNvPicPr/>
+                  </pic:nvPicPr>
+                  <pic:blipFill>
+                    <a:blip r:embed="rId10"/>
+                    <a:stretch>
+                      <a:fillRect/>
+                    </a:stretch>
+                  </pic:blipFill>
+                  <pic:spPr>
+                    <a:xfrm>
+                      <a:off x="0" y="0"/>
+                      <a:ext cx="5303520" cy="3336015"/>
+                    </a:xfrm>
+                    <a:prstGeom prst="rect"/>
+                  </pic:spPr>
+                </pic:pic>
+              </a:graphicData>
+            </a:graphic>
+          </wp:inline>
+        </w:drawing>
+      </w:r>
+    </w:p>
+    <w:p>
+      <w:pPr>
+        <w:spacing w:before="40" w:after="120"/>
+        <w:jc w:val="center"/>
+      </w:pPr>
+      <w:r>
+        <w:rPr>
+          <w:i/>
+          <w:color w:val="505050"/>
+          <w:sz w:val="16"/>
+        </w:rPr>
+        <w:t>Figure 2 – Five LLM providers queried in parallel; best diagram selected by LLM judge</w:t>
+      </w:r>
+    </w:p>
+    <w:p>
+      <w:pPr>
+        <w:spacing w:before="140" w:after="40"/>
       </w:pPr>
       <w:r>
         <w:rPr>
           <w:b/>
           <w:color w:val="00467F"/>
-          <w:sz w:val="22"/>
+          <w:sz w:val="21"/>
         </w:rPr>
         <w:t>4. Hypothesis &amp; Proposed Methodology</w:t>
       </w:r>
@@ -253,18 +359,71 @@
         <w:rPr>
           <w:sz w:val="18"/>
         </w:rPr>
-        <w:t>Methodology: The system (1) analyzes source code to extract structural context (imports, classes, methods, dependencies); (2) constructs a structured prompt for a senior-architect persona and fans out to five LLM providers in parallel — DeepSeek, Anthropic Claude, Google Gemini, Mistral, and Groq; (3) parses and extracts PlantUML sequence and class diagram blocks from each response; (4) scores and ranks candidates via an LLM judge (heuristic fallback if unavailable); (5) reconstructs source code from the winning diagram pair; and (6) measures accuracy across five weighted metrics: AST shape (30%), token Jaccard (20%), line-diff overlap (20%), semantic score (20%), and structural function matching (10%).</w:t>
+        <w:t>Methodology: The system (1) analyzes source code to extract structural context (imports, classes, methods); (2) builds a structured architect-persona prompt; (3) fans out to five LLM providers in parallel (DeepSeek, Claude, Gemini, Mistral, Groq); (4) parses PlantUML sequence and class blocks from each response; (5) scores and ranks candidates via an LLM judge with heuristic fallback; (6) reconstructs source code from the winning diagram pair; and (7) measures accuracy across five weighted metrics (Figure 3).</w:t>
       </w:r>
     </w:p>
     <w:p>
       <w:pPr>
-        <w:spacing w:before="120" w:after="40"/>
+        <w:jc w:val="center"/>
+      </w:pPr>
+      <w:r>
+        <w:drawing>
+          <wp:inline xmlns:a="http://schemas.openxmlformats.org/drawingml/2006/main" xmlns:pic="http://schemas.openxmlformats.org/drawingml/2006/picture">
+            <wp:extent cx="4572000" cy="2112490"/>
+            <wp:docPr id="3" name="Picture 3"/>
+            <wp:cNvGraphicFramePr>
+              <a:graphicFrameLocks noChangeAspect="1"/>
+            </wp:cNvGraphicFramePr>
+            <a:graphic>
+              <a:graphicData uri="http://schemas.openxmlformats.org/drawingml/2006/picture">
+                <pic:pic>
+                  <pic:nvPicPr>
+                    <pic:cNvPr id="0" name="image.png"/>
+                    <pic:cNvPicPr/>
+                  </pic:nvPicPr>
+                  <pic:blipFill>
+                    <a:blip r:embed="rId11"/>
+                    <a:stretch>
+                      <a:fillRect/>
+                    </a:stretch>
+                  </pic:blipFill>
+                  <pic:spPr>
+                    <a:xfrm>
+                      <a:off x="0" y="0"/>
+                      <a:ext cx="4572000" cy="2112490"/>
+                    </a:xfrm>
+                    <a:prstGeom prst="rect"/>
+                  </pic:spPr>
+                </pic:pic>
+              </a:graphicData>
+            </a:graphic>
+          </wp:inline>
+        </w:drawing>
+      </w:r>
+    </w:p>
+    <w:p>
+      <w:pPr>
+        <w:spacing w:before="40" w:after="120"/>
+        <w:jc w:val="center"/>
+      </w:pPr>
+      <w:r>
+        <w:rPr>
+          <w:i/>
+          <w:color w:val="505050"/>
+          <w:sz w:val="16"/>
+        </w:rPr>
+        <w:t>Figure 3 – Five-metric accuracy scoring framework with assigned weights</w:t>
+      </w:r>
+    </w:p>
+    <w:p>
+      <w:pPr>
+        <w:spacing w:before="140" w:after="40"/>
       </w:pPr>
       <w:r>
         <w:rPr>
           <w:b/>
           <w:color w:val="00467F"/>
-          <w:sz w:val="22"/>
+          <w:sz w:val="21"/>
         </w:rPr>
         <w:t>5. Our Contribution / Continuation</w:t>
       </w:r>
@@ -277,7 +436,7 @@
         <w:rPr>
           <w:sz w:val="18"/>
         </w:rPr>
-        <w:t>This work introduces the first multi-LLM comparative pipeline for automated UML diagram generation with a closed-loop accuracy evaluation. Key contributions: (a) parallel multi-provider generation with automatic failover ensures robustness; (b) LLM-based judging with heuristic fallback provides reliable quality ranking; (c) code reconstruction from diagrams as a novel validation technique quantifies diagram fidelity; (d) a weighted five-metric accuracy framework goes beyond prior binary pass/fail assessments; and (e) a git-hook integration enables continuous, commit-level documentation updates. Future continuation includes fine-tuning domain-specific diagram models and extending support to additional languages and CI/CD platforms.</w:t>
+        <w:t>This work introduces the first multi-LLM comparative pipeline for automated UML diagram generation with closed-loop accuracy validation. Key contributions: (a) parallel multi-provider generation with automatic failover for robustness; (b) LLM-based judging with heuristic fallback for reliable quality ranking; (c) code reconstruction from diagrams as a novel validation technique that quantifies diagram fidelity; (d) a five-metric weighted accuracy framework surpassing binary pass/fail assessments; and (e) git-hook integration enabling continuous commit-level documentation. Future work includes fine-tuning domain-specific models and extending CI/CD integration across multiple platforms.</w:t>
       </w:r>
     </w:p>
     <w:sectPr>

</xml_diff>